<commit_message>
Draft_112: match Table 1 formatting to Tables 2-8 (style, borders, 9pt)
</commit_message>
<xml_diff>
--- a/thesis/003_ThesisProposal_Draft_112_body.docx
+++ b/thesis/003_ThesisProposal_Draft_112_body.docx
@@ -2602,16 +2602,12 @@
     </w:p>
     <w:tbl>
       <w:tblPr>
-        <w:tblW w:type="auto" w:w="0"/>
-        <w:tblLook w:firstColumn="1" w:firstRow="1" w:lastColumn="0" w:lastRow="0" w:noHBand="0" w:noVBand="1" w:val="04A0"/>
-        <w:tblBorders>
-          <w:top w:val="single" w:sz="4" w:space="0" w:color="000000"/>
-          <w:left w:val="single" w:sz="4" w:space="0" w:color="000000"/>
-          <w:bottom w:val="single" w:sz="4" w:space="0" w:color="000000"/>
-          <w:right w:val="single" w:sz="4" w:space="0" w:color="000000"/>
-          <w:insideH w:val="single" w:sz="4" w:space="0" w:color="000000"/>
-          <w:insideV w:val="single" w:sz="4" w:space="0" w:color="000000"/>
-        </w:tblBorders>
+        <w:tblStyle w:val="Table2"/>
+        <w:tblW w:w="8307.0" w:type="dxa"/>
+        <w:jc w:val="left"/>
+        <w:tblInd w:w="-223.0" w:type="dxa"/>
+        <w:tblLayout w:type="fixed"/>
+        <w:tblLook w:val="0400"/>
       </w:tblPr>
       <w:tblGrid>
         <w:gridCol w:w="2769"/>
@@ -2621,19 +2617,21 @@
       <w:tr>
         <w:tc>
           <w:tcPr>
-            <w:tcW w:type="dxa" w:w="3024"/>
-            <w:shd w:val="clear" w:color="auto" w:fill="D9D9D9"/>
+            <w:tcW w:w="2769" w:type="dxa"/>
+            <w:tcBorders>
+              <w:top w:color="000000" w:space="0" w:sz="18" w:val="single"/>
+              <w:bottom w:color="000000" w:space="0" w:sz="4" w:val="single"/>
+            </w:tcBorders>
           </w:tcPr>
           <w:p>
             <w:pPr>
-              <w:spacing w:before="20" w:after="20" w:line="240" w:lineRule="auto"/>
+              <w:spacing w:before="0" w:after="0" w:line="240" w:lineRule="auto"/>
               <w:jc w:val="left"/>
             </w:pPr>
             <w:r>
               <w:rPr>
-                <w:rFonts w:ascii="Georgia" w:hAnsi="Georgia" w:eastAsia="Georgia"/>
                 <w:b/>
-                <w:sz w:val="16"/>
+                <w:sz w:val="18"/>
               </w:rPr>
               <w:t>Token / construction</w:t>
             </w:r>
@@ -2641,19 +2639,21 @@
         </w:tc>
         <w:tc>
           <w:tcPr>
-            <w:tcW w:type="dxa" w:w="3024"/>
-            <w:shd w:val="clear" w:color="auto" w:fill="D9D9D9"/>
+            <w:tcW w:w="2769" w:type="dxa"/>
+            <w:tcBorders>
+              <w:top w:color="000000" w:space="0" w:sz="18" w:val="single"/>
+              <w:bottom w:color="000000" w:space="0" w:sz="4" w:val="single"/>
+            </w:tcBorders>
           </w:tcPr>
           <w:p>
             <w:pPr>
-              <w:spacing w:before="20" w:after="20" w:line="240" w:lineRule="auto"/>
+              <w:spacing w:before="0" w:after="0" w:line="240" w:lineRule="auto"/>
               <w:jc w:val="left"/>
             </w:pPr>
             <w:r>
               <w:rPr>
-                <w:rFonts w:ascii="Georgia" w:hAnsi="Georgia" w:eastAsia="Georgia"/>
                 <w:b/>
-                <w:sz w:val="16"/>
+                <w:sz w:val="18"/>
               </w:rPr>
               <w:t>Hedge when</w:t>
             </w:r>
@@ -2661,19 +2661,21 @@
         </w:tc>
         <w:tc>
           <w:tcPr>
-            <w:tcW w:type="dxa" w:w="3024"/>
-            <w:shd w:val="clear" w:color="auto" w:fill="D9D9D9"/>
+            <w:tcW w:w="2769" w:type="dxa"/>
+            <w:tcBorders>
+              <w:top w:color="000000" w:space="0" w:sz="18" w:val="single"/>
+              <w:bottom w:color="000000" w:space="0" w:sz="4" w:val="single"/>
+            </w:tcBorders>
           </w:tcPr>
           <w:p>
             <w:pPr>
-              <w:spacing w:before="20" w:after="20" w:line="240" w:lineRule="auto"/>
+              <w:spacing w:before="0" w:after="0" w:line="240" w:lineRule="auto"/>
               <w:jc w:val="left"/>
             </w:pPr>
             <w:r>
               <w:rPr>
-                <w:rFonts w:ascii="Georgia" w:hAnsi="Georgia" w:eastAsia="Georgia"/>
                 <w:b/>
-                <w:sz w:val="16"/>
+                <w:sz w:val="18"/>
               </w:rPr>
               <w:t>Not a hedge when</w:t>
             </w:r>
@@ -2683,18 +2685,17 @@
       <w:tr>
         <w:tc>
           <w:tcPr>
-            <w:tcW w:type="dxa" w:w="3024"/>
+            <w:tcW w:w="2769" w:type="dxa"/>
           </w:tcPr>
           <w:p>
             <w:pPr>
-              <w:spacing w:before="20" w:after="20" w:line="240" w:lineRule="auto"/>
+              <w:spacing w:before="0" w:after="0" w:line="240" w:lineRule="auto"/>
               <w:jc w:val="left"/>
             </w:pPr>
             <w:r>
               <w:rPr>
-                <w:rFonts w:ascii="Georgia" w:hAnsi="Georgia" w:eastAsia="Georgia"/>
                 <w:b w:val="0"/>
-                <w:sz w:val="16"/>
+                <w:sz w:val="18"/>
               </w:rPr>
               <w:t>can + active content verb (e.g., enhance, promote, reduce, help)</w:t>
             </w:r>
@@ -2702,18 +2703,17 @@
         </w:tc>
         <w:tc>
           <w:tcPr>
-            <w:tcW w:type="dxa" w:w="3024"/>
+            <w:tcW w:w="2769" w:type="dxa"/>
           </w:tcPr>
           <w:p>
             <w:pPr>
-              <w:spacing w:before="20" w:after="20" w:line="240" w:lineRule="auto"/>
+              <w:spacing w:before="0" w:after="0" w:line="240" w:lineRule="auto"/>
               <w:jc w:val="left"/>
             </w:pPr>
             <w:r>
               <w:rPr>
-                <w:rFonts w:ascii="Georgia" w:hAnsi="Georgia" w:eastAsia="Georgia"/>
                 <w:b w:val="0"/>
-                <w:sz w:val="16"/>
+                <w:sz w:val="18"/>
               </w:rPr>
               <w:t>Removing can raises the epistemic weight of a finding-claim (possibility reading).</w:t>
             </w:r>
@@ -2721,18 +2721,17 @@
         </w:tc>
         <w:tc>
           <w:tcPr>
-            <w:tcW w:type="dxa" w:w="3024"/>
+            <w:tcW w:w="2769" w:type="dxa"/>
           </w:tcPr>
           <w:p>
             <w:pPr>
-              <w:spacing w:before="20" w:after="20" w:line="240" w:lineRule="auto"/>
+              <w:spacing w:before="0" w:after="0" w:line="240" w:lineRule="auto"/>
               <w:jc w:val="left"/>
             </w:pPr>
             <w:r>
               <w:rPr>
-                <w:rFonts w:ascii="Georgia" w:hAnsi="Georgia" w:eastAsia="Georgia"/>
                 <w:b w:val="0"/>
-                <w:sz w:val="16"/>
+                <w:sz w:val="18"/>
               </w:rPr>
               <w:t>Marks capability or ability only (false positive).</w:t>
             </w:r>
@@ -2742,18 +2741,17 @@
       <w:tr>
         <w:tc>
           <w:tcPr>
-            <w:tcW w:type="dxa" w:w="3024"/>
+            <w:tcW w:w="2769" w:type="dxa"/>
           </w:tcPr>
           <w:p>
             <w:pPr>
-              <w:spacing w:before="20" w:after="20" w:line="240" w:lineRule="auto"/>
+              <w:spacing w:before="0" w:after="0" w:line="240" w:lineRule="auto"/>
               <w:jc w:val="left"/>
             </w:pPr>
             <w:r>
               <w:rPr>
-                <w:rFonts w:ascii="Georgia" w:hAnsi="Georgia" w:eastAsia="Georgia"/>
                 <w:b w:val="0"/>
-                <w:sz w:val="16"/>
+                <w:sz w:val="18"/>
               </w:rPr>
               <w:t>indicating / indicates</w:t>
             </w:r>
@@ -2761,18 +2759,17 @@
         </w:tc>
         <w:tc>
           <w:tcPr>
-            <w:tcW w:type="dxa" w:w="3024"/>
+            <w:tcW w:w="2769" w:type="dxa"/>
           </w:tcPr>
           <w:p>
             <w:pPr>
-              <w:spacing w:before="20" w:after="20" w:line="240" w:lineRule="auto"/>
+              <w:spacing w:before="0" w:after="0" w:line="240" w:lineRule="auto"/>
               <w:jc w:val="left"/>
             </w:pPr>
             <w:r>
               <w:rPr>
-                <w:rFonts w:ascii="Georgia" w:hAnsi="Georgia" w:eastAsia="Georgia"/>
                 <w:b w:val="0"/>
-                <w:sz w:val="16"/>
+                <w:sz w:val="18"/>
               </w:rPr>
               <w:t>Introduces an inference beyond the operational definition of the result.</w:t>
             </w:r>
@@ -2780,18 +2777,17 @@
         </w:tc>
         <w:tc>
           <w:tcPr>
-            <w:tcW w:type="dxa" w:w="3024"/>
+            <w:tcW w:w="2769" w:type="dxa"/>
           </w:tcPr>
           <w:p>
             <w:pPr>
-              <w:spacing w:before="20" w:after="20" w:line="240" w:lineRule="auto"/>
+              <w:spacing w:before="0" w:after="0" w:line="240" w:lineRule="auto"/>
               <w:jc w:val="left"/>
             </w:pPr>
             <w:r>
               <w:rPr>
-                <w:rFonts w:ascii="Georgia" w:hAnsi="Georgia" w:eastAsia="Georgia"/>
                 <w:b w:val="0"/>
-                <w:sz w:val="16"/>
+                <w:sz w:val="18"/>
               </w:rPr>
               <w:t>Restates a field-standard threshold or the operational meaning of the measure (false positive).</w:t>
             </w:r>
@@ -2801,18 +2797,17 @@
       <w:tr>
         <w:tc>
           <w:tcPr>
-            <w:tcW w:type="dxa" w:w="3024"/>
+            <w:tcW w:w="2769" w:type="dxa"/>
           </w:tcPr>
           <w:p>
             <w:pPr>
-              <w:spacing w:before="20" w:after="20" w:line="240" w:lineRule="auto"/>
+              <w:spacing w:before="0" w:after="0" w:line="240" w:lineRule="auto"/>
               <w:jc w:val="left"/>
             </w:pPr>
             <w:r>
               <w:rPr>
-                <w:rFonts w:ascii="Georgia" w:hAnsi="Georgia" w:eastAsia="Georgia"/>
                 <w:b w:val="0"/>
-                <w:sz w:val="16"/>
+                <w:sz w:val="18"/>
               </w:rPr>
               <w:t>potential + noun</w:t>
             </w:r>
@@ -2820,18 +2815,17 @@
         </w:tc>
         <w:tc>
           <w:tcPr>
-            <w:tcW w:type="dxa" w:w="3024"/>
+            <w:tcW w:w="2769" w:type="dxa"/>
           </w:tcPr>
           <w:p>
             <w:pPr>
-              <w:spacing w:before="20" w:after="20" w:line="240" w:lineRule="auto"/>
+              <w:spacing w:before="0" w:after="0" w:line="240" w:lineRule="auto"/>
               <w:jc w:val="left"/>
             </w:pPr>
             <w:r>
               <w:rPr>
-                <w:rFonts w:ascii="Georgia" w:hAnsi="Georgia" w:eastAsia="Georgia"/>
                 <w:b w:val="0"/>
-                <w:sz w:val="16"/>
+                <w:sz w:val="18"/>
               </w:rPr>
               <w:t>Results or conclusion frame that qualifies a finding-claim, and the Working Test holds.</w:t>
             </w:r>
@@ -2839,18 +2833,17 @@
         </w:tc>
         <w:tc>
           <w:tcPr>
-            <w:tcW w:type="dxa" w:w="3024"/>
+            <w:tcW w:w="2769" w:type="dxa"/>
           </w:tcPr>
           <w:p>
             <w:pPr>
-              <w:spacing w:before="20" w:after="20" w:line="240" w:lineRule="auto"/>
+              <w:spacing w:before="0" w:after="0" w:line="240" w:lineRule="auto"/>
               <w:jc w:val="left"/>
             </w:pPr>
             <w:r>
               <w:rPr>
-                <w:rFonts w:ascii="Georgia" w:hAnsi="Georgia" w:eastAsia="Georgia"/>
                 <w:b w:val="0"/>
-                <w:sz w:val="16"/>
+                <w:sz w:val="18"/>
               </w:rPr>
               <w:t>Aim or methods clause (non-claim / topic-naming; fails the claim condition).</w:t>
             </w:r>
@@ -2860,18 +2853,17 @@
       <w:tr>
         <w:tc>
           <w:tcPr>
-            <w:tcW w:type="dxa" w:w="3024"/>
+            <w:tcW w:w="2769" w:type="dxa"/>
           </w:tcPr>
           <w:p>
             <w:pPr>
-              <w:spacing w:before="20" w:after="20" w:line="240" w:lineRule="auto"/>
+              <w:spacing w:before="0" w:after="0" w:line="240" w:lineRule="auto"/>
               <w:jc w:val="left"/>
             </w:pPr>
             <w:r>
               <w:rPr>
-                <w:rFonts w:ascii="Georgia" w:hAnsi="Georgia" w:eastAsia="Georgia"/>
                 <w:b w:val="0"/>
-                <w:sz w:val="16"/>
+                <w:sz w:val="18"/>
               </w:rPr>
               <w:t>possibility + noun</w:t>
             </w:r>
@@ -2879,18 +2871,17 @@
         </w:tc>
         <w:tc>
           <w:tcPr>
-            <w:tcW w:type="dxa" w:w="3024"/>
+            <w:tcW w:w="2769" w:type="dxa"/>
           </w:tcPr>
           <w:p>
             <w:pPr>
-              <w:spacing w:before="20" w:after="20" w:line="240" w:lineRule="auto"/>
+              <w:spacing w:before="0" w:after="0" w:line="240" w:lineRule="auto"/>
               <w:jc w:val="left"/>
             </w:pPr>
             <w:r>
               <w:rPr>
-                <w:rFonts w:ascii="Georgia" w:hAnsi="Georgia" w:eastAsia="Georgia"/>
                 <w:b w:val="0"/>
-                <w:sz w:val="16"/>
+                <w:sz w:val="18"/>
               </w:rPr>
               <w:t>Same claim-condition treatment as potential when the host is a finding-claim.</w:t>
             </w:r>
@@ -2898,18 +2889,17 @@
         </w:tc>
         <w:tc>
           <w:tcPr>
-            <w:tcW w:type="dxa" w:w="3024"/>
+            <w:tcW w:w="2769" w:type="dxa"/>
           </w:tcPr>
           <w:p>
             <w:pPr>
-              <w:spacing w:before="20" w:after="20" w:line="240" w:lineRule="auto"/>
+              <w:spacing w:before="0" w:after="0" w:line="240" w:lineRule="auto"/>
               <w:jc w:val="left"/>
             </w:pPr>
             <w:r>
               <w:rPr>
-                <w:rFonts w:ascii="Georgia" w:hAnsi="Georgia" w:eastAsia="Georgia"/>
                 <w:b w:val="0"/>
-                <w:sz w:val="16"/>
+                <w:sz w:val="18"/>
               </w:rPr>
               <w:t>Aim or method sentence (non-claim).</w:t>
             </w:r>
@@ -2919,18 +2909,20 @@
       <w:tr>
         <w:tc>
           <w:tcPr>
-            <w:tcW w:type="dxa" w:w="3024"/>
+            <w:tcW w:w="2769" w:type="dxa"/>
+            <w:tcBorders>
+              <w:bottom w:color="000000" w:space="0" w:sz="18" w:val="single"/>
+            </w:tcBorders>
           </w:tcPr>
           <w:p>
             <w:pPr>
-              <w:spacing w:before="20" w:after="20" w:line="240" w:lineRule="auto"/>
+              <w:spacing w:before="0" w:after="0" w:line="240" w:lineRule="auto"/>
               <w:jc w:val="left"/>
             </w:pPr>
             <w:r>
               <w:rPr>
-                <w:rFonts w:ascii="Georgia" w:hAnsi="Georgia" w:eastAsia="Georgia"/>
                 <w:b w:val="0"/>
-                <w:sz w:val="16"/>
+                <w:sz w:val="18"/>
               </w:rPr>
               <w:t>Multiple hedge-like tokens in one sentence</w:t>
             </w:r>
@@ -2938,18 +2930,20 @@
         </w:tc>
         <w:tc>
           <w:tcPr>
-            <w:tcW w:type="dxa" w:w="3024"/>
+            <w:tcW w:w="2769" w:type="dxa"/>
+            <w:tcBorders>
+              <w:bottom w:color="000000" w:space="0" w:sz="18" w:val="single"/>
+            </w:tcBorders>
           </w:tcPr>
           <w:p>
             <w:pPr>
-              <w:spacing w:before="20" w:after="20" w:line="240" w:lineRule="auto"/>
+              <w:spacing w:before="0" w:after="0" w:line="240" w:lineRule="auto"/>
               <w:jc w:val="left"/>
             </w:pPr>
             <w:r>
               <w:rPr>
-                <w:rFonts w:ascii="Georgia" w:hAnsi="Georgia" w:eastAsia="Georgia"/>
                 <w:b w:val="0"/>
-                <w:sz w:val="16"/>
+                <w:sz w:val="18"/>
               </w:rPr>
               <w:t>Each token is tested on its own host clause under the claim condition and the two removal checks.</w:t>
             </w:r>
@@ -2957,18 +2951,20 @@
         </w:tc>
         <w:tc>
           <w:tcPr>
-            <w:tcW w:type="dxa" w:w="3024"/>
+            <w:tcW w:w="2769" w:type="dxa"/>
+            <w:tcBorders>
+              <w:bottom w:color="000000" w:space="0" w:sz="18" w:val="single"/>
+            </w:tcBorders>
           </w:tcPr>
           <w:p>
             <w:pPr>
-              <w:spacing w:before="20" w:after="20" w:line="240" w:lineRule="auto"/>
+              <w:spacing w:before="0" w:after="0" w:line="240" w:lineRule="auto"/>
               <w:jc w:val="left"/>
             </w:pPr>
             <w:r>
               <w:rPr>
-                <w:rFonts w:ascii="Georgia" w:hAnsi="Georgia" w:eastAsia="Georgia"/>
                 <w:b w:val="0"/>
-                <w:sz w:val="16"/>
+                <w:sz w:val="18"/>
               </w:rPr>
               <w:t>A preceding hedge (e.g., suggest) does not determine the function of another token (e.g., can).</w:t>
             </w:r>

</xml_diff>

<commit_message>
Draft_112: move Table 2 (sampling) and discussion from Methodology to RAD after opening
</commit_message>
<xml_diff>
--- a/thesis/003_ThesisProposal_Draft_112_body.docx
+++ b/thesis/003_ThesisProposal_Draft_112_body.docx
@@ -3022,6 +3022,136 @@
     </w:p>
     <w:p>
       <w:pPr>
+        <w:spacing w:after="0" w:before="0" w:line="480" w:lineRule="auto"/>
+        <w:ind w:firstLine="720"/>
+        <w:jc w:val="both"/>
+        <w:rPr/>
+      </w:pPr>
+      <w:r>
+        <w:rPr>
+          <w:b w:val="1"/>
+          <w:bCs w:val="1"/>
+          <w:rtl w:val="0"/>
+        </w:rPr>
+        <w:t xml:space="preserve">Inclusion Criteria. </w:t>
+      </w:r>
+      <w:r>
+        <w:rPr>
+          <w:rtl w:val="0"/>
+        </w:rPr>
+        <w:t xml:space="preserve">English-language undergraduate thesis abstracts. Complete abstracts available in the PSAU library archives. Clear disciplinary classification based on official degree program. Hard-bound submission year (as recorded in the PSAU library catalog) between 2023 and 2025.</w:t>
+      </w:r>
+    </w:p>
+    <w:p>
+      <w:pPr>
+        <w:keepLines w:val="1"/>
+        <w:spacing w:after="0" w:before="0" w:line="480" w:lineRule="auto"/>
+        <w:ind w:firstLine="720"/>
+        <w:jc w:val="both"/>
+        <w:rPr/>
+      </w:pPr>
+      <w:r>
+        <w:rPr>
+          <w:b w:val="1"/>
+          <w:bCs w:val="1"/>
+          <w:rtl w:val="0"/>
+        </w:rPr>
+        <w:t xml:space="preserve">Exclusion Criteria. </w:t>
+      </w:r>
+      <w:r>
+        <w:rPr>
+          <w:rtl w:val="0"/>
+        </w:rPr>
+        <w:t xml:space="preserve">Non-English abstracts or abstracts with significant Filipino code-switching. Graduate-level theses. Theses submitted under interdisciplinary degree programs (e.g., Environmental Science) where a single disciplinary affiliation cannot be determined. Theses whose hard-bound submission year (library catalog) is before 2023 or after 2025.</w:t>
+      </w:r>
+    </w:p>
+    <w:p>
+      <w:pPr>
+        <w:spacing w:after="0" w:before="0" w:line="480" w:lineRule="auto"/>
+        <w:ind w:firstLine="720"/>
+        <w:jc w:val="both"/>
+        <w:rPr/>
+        <w:sectPr>
+          <w:headerReference r:id="rId17" w:type="default"/>
+          <w:headerReference r:id="rId18" w:type="first"/>
+          <w:footerReference r:id="rId19" w:type="default"/>
+          <w:footerReference r:id="rId20" w:type="first"/>
+          <w:type w:val="nextPage"/>
+          <w:pgSz w:h="16838" w:w="11906" w:orient="portrait"/>
+          <w:pgMar w:bottom="1440" w:top="1440" w:left="2160" w:right="1440" w:header="720" w:footer="720"/>
+          <w:titlePg w:val="1"/>
+        </w:sectPr>
+      </w:pPr>
+      <w:r>
+        <w:rPr>
+          <w:b w:val="1"/>
+          <w:bCs w:val="1"/>
+          <w:rtl w:val="0"/>
+        </w:rPr>
+        <w:t xml:space="preserve">Ethical Considerations.</w:t>
+      </w:r>
+      <w:r>
+        <w:rPr>
+          <w:rtl w:val="0"/>
+        </w:rPr>
+        <w:t xml:space="preserve"> Abstracts were accessed on-site at the PSAU Library with proper authorization. Student names were fully anonymized using discipline codes (Acs1-Acs10, Aas1-Aas10, VM1-VM20, B1-B20) before analysis began. Thesis titles that appear as quoted wording inside an abstract (source text) were redacted in the coded appendix where they identified the work. Residual title fragments, if any, do not include student names. The study analyzed linguistic patterns in text, not student performance or personal information. All data files were stored on password-protected devices and encrypted cloud storage accessible only to the researcher and thesis adviser. These files are retained for five years to support verification of coding decisions by future researchers and to allow for follow-up comparative studies, after which they are permanently deleted in line with standard academic data retention practice.</w:t>
+      </w:r>
+    </w:p>
+    <w:p>
+      <w:pPr>
+        <w:spacing w:after="240" w:before="720" w:line="480" w:lineRule="auto"/>
+        <w:ind w:firstLine="0"/>
+        <w:jc w:val="center"/>
+        <w:rPr>
+          <w:sz w:val="28"/>
+          <w:szCs w:val="28"/>
+        </w:rPr>
+      </w:pPr>
+      <w:r>
+        <w:rPr>
+          <w:b w:val="1"/>
+          <w:bCs w:val="1"/>
+          <w:sz w:val="28"/>
+          <w:szCs w:val="28"/>
+          <w:rtl w:val="0"/>
+        </w:rPr>
+        <w:t xml:space="preserve">RESULTS, ANALYSIS, AND DISCUSSION</w:t>
+      </w:r>
+      <w:r>
+        <w:rPr>
+          <w:rtl w:val="0"/>
+        </w:rPr>
+      </w:r>
+    </w:p>
+    <w:p>
+      <w:pPr>
+        <w:spacing w:after="0" w:before="0" w:line="480" w:lineRule="auto"/>
+        <w:ind w:firstLine="720"/>
+        <w:jc w:val="both"/>
+        <w:rPr/>
+      </w:pPr>
+      <w:r>
+        <w:rPr>
+          <w:rtl w:val="0"/>
+        </w:rPr>
+      </w:r>
+    </w:p>
+    <w:p>
+      <w:pPr>
+        <w:spacing w:after="0" w:before="0" w:line="480" w:lineRule="auto"/>
+        <w:ind w:firstLine="720"/>
+        <w:jc w:val="both"/>
+        <w:rPr/>
+      </w:pPr>
+      <w:r>
+        <w:rPr>
+          <w:rtl w:val="0"/>
+        </w:rPr>
+        <w:t xml:space="preserve">This chapter presents the results, analysis, and discussion of the hedging patterns identified in the 60 undergraduate thesis abstracts across Agriculture, Veterinary Medicine, and Biology at Pampanga State Agricultural University. The patterns are read as evidence of how these writers used English to manage claim strength in a short, supervised genre. The chapter is organized into four parts, each corresponding to a research question. Part I presents the types of hedging devices found across the three disciplines. Part II examines how hedge frequency varies across Agriculture, Veterinary Medicine, and Biology. Part III identifies the rhetorical functions served by the hedging devices. Part IV discusses the main cross-disciplinary contrast in the ratified abstracts of developing researchers at PSAU.</w:t>
+      </w:r>
+    </w:p>
+    <w:p>
+      <w:pPr>
         <w:keepNext w:val="1"/>
         <w:spacing w:after="0" w:before="240" w:line="480" w:lineRule="auto"/>
         <w:ind w:firstLine="0"/>
@@ -4160,136 +4290,6 @@
           <w:sz w:val="22"/>
         </w:rPr>
         <w:t>Table 2 presents the repository populations and the final sample distribution. The target pool for 2023-2025 totals 381 theses. Equal allocation gives each discipline a comparable sample size and keeps the smaller Animal Science population from being underrepresented. Pre-2023 theses (n=447) serve as the source pool for pilot abstracts to keep them distinct from the main study period.</w:t>
-      </w:r>
-    </w:p>
-    <w:p>
-      <w:pPr>
-        <w:spacing w:after="0" w:before="0" w:line="480" w:lineRule="auto"/>
-        <w:ind w:firstLine="720"/>
-        <w:jc w:val="both"/>
-        <w:rPr/>
-      </w:pPr>
-      <w:r>
-        <w:rPr>
-          <w:b w:val="1"/>
-          <w:bCs w:val="1"/>
-          <w:rtl w:val="0"/>
-        </w:rPr>
-        <w:t xml:space="preserve">Inclusion Criteria. </w:t>
-      </w:r>
-      <w:r>
-        <w:rPr>
-          <w:rtl w:val="0"/>
-        </w:rPr>
-        <w:t xml:space="preserve">English-language undergraduate thesis abstracts. Complete abstracts available in the PSAU library archives. Clear disciplinary classification based on official degree program. Hard-bound submission year (as recorded in the PSAU library catalog) between 2023 and 2025.</w:t>
-      </w:r>
-    </w:p>
-    <w:p>
-      <w:pPr>
-        <w:keepLines w:val="1"/>
-        <w:spacing w:after="0" w:before="0" w:line="480" w:lineRule="auto"/>
-        <w:ind w:firstLine="720"/>
-        <w:jc w:val="both"/>
-        <w:rPr/>
-      </w:pPr>
-      <w:r>
-        <w:rPr>
-          <w:b w:val="1"/>
-          <w:bCs w:val="1"/>
-          <w:rtl w:val="0"/>
-        </w:rPr>
-        <w:t xml:space="preserve">Exclusion Criteria. </w:t>
-      </w:r>
-      <w:r>
-        <w:rPr>
-          <w:rtl w:val="0"/>
-        </w:rPr>
-        <w:t xml:space="preserve">Non-English abstracts or abstracts with significant Filipino code-switching. Graduate-level theses. Theses submitted under interdisciplinary degree programs (e.g., Environmental Science) where a single disciplinary affiliation cannot be determined. Theses whose hard-bound submission year (library catalog) is before 2023 or after 2025.</w:t>
-      </w:r>
-    </w:p>
-    <w:p>
-      <w:pPr>
-        <w:spacing w:after="0" w:before="0" w:line="480" w:lineRule="auto"/>
-        <w:ind w:firstLine="720"/>
-        <w:jc w:val="both"/>
-        <w:rPr/>
-        <w:sectPr>
-          <w:headerReference r:id="rId17" w:type="default"/>
-          <w:headerReference r:id="rId18" w:type="first"/>
-          <w:footerReference r:id="rId19" w:type="default"/>
-          <w:footerReference r:id="rId20" w:type="first"/>
-          <w:type w:val="nextPage"/>
-          <w:pgSz w:h="16838" w:w="11906" w:orient="portrait"/>
-          <w:pgMar w:bottom="1440" w:top="1440" w:left="2160" w:right="1440" w:header="720" w:footer="720"/>
-          <w:titlePg w:val="1"/>
-        </w:sectPr>
-      </w:pPr>
-      <w:r>
-        <w:rPr>
-          <w:b w:val="1"/>
-          <w:bCs w:val="1"/>
-          <w:rtl w:val="0"/>
-        </w:rPr>
-        <w:t xml:space="preserve">Ethical Considerations.</w:t>
-      </w:r>
-      <w:r>
-        <w:rPr>
-          <w:rtl w:val="0"/>
-        </w:rPr>
-        <w:t xml:space="preserve"> Abstracts were accessed on-site at the PSAU Library with proper authorization. Student names were fully anonymized using discipline codes (Acs1-Acs10, Aas1-Aas10, VM1-VM20, B1-B20) before analysis began. Thesis titles that appear as quoted wording inside an abstract (source text) were redacted in the coded appendix where they identified the work. Residual title fragments, if any, do not include student names. The study analyzed linguistic patterns in text, not student performance or personal information. All data files were stored on password-protected devices and encrypted cloud storage accessible only to the researcher and thesis adviser. These files are retained for five years to support verification of coding decisions by future researchers and to allow for follow-up comparative studies, after which they are permanently deleted in line with standard academic data retention practice.</w:t>
-      </w:r>
-    </w:p>
-    <w:p>
-      <w:pPr>
-        <w:spacing w:after="240" w:before="720" w:line="480" w:lineRule="auto"/>
-        <w:ind w:firstLine="0"/>
-        <w:jc w:val="center"/>
-        <w:rPr>
-          <w:sz w:val="28"/>
-          <w:szCs w:val="28"/>
-        </w:rPr>
-      </w:pPr>
-      <w:r>
-        <w:rPr>
-          <w:b w:val="1"/>
-          <w:bCs w:val="1"/>
-          <w:sz w:val="28"/>
-          <w:szCs w:val="28"/>
-          <w:rtl w:val="0"/>
-        </w:rPr>
-        <w:t xml:space="preserve">RESULTS, ANALYSIS, AND DISCUSSION</w:t>
-      </w:r>
-      <w:r>
-        <w:rPr>
-          <w:rtl w:val="0"/>
-        </w:rPr>
-      </w:r>
-    </w:p>
-    <w:p>
-      <w:pPr>
-        <w:spacing w:after="0" w:before="0" w:line="480" w:lineRule="auto"/>
-        <w:ind w:firstLine="720"/>
-        <w:jc w:val="both"/>
-        <w:rPr/>
-      </w:pPr>
-      <w:r>
-        <w:rPr>
-          <w:rtl w:val="0"/>
-        </w:rPr>
-      </w:r>
-    </w:p>
-    <w:p>
-      <w:pPr>
-        <w:spacing w:after="0" w:before="0" w:line="480" w:lineRule="auto"/>
-        <w:ind w:firstLine="720"/>
-        <w:jc w:val="both"/>
-        <w:rPr/>
-      </w:pPr>
-      <w:r>
-        <w:rPr>
-          <w:rtl w:val="0"/>
-        </w:rPr>
-        <w:t xml:space="preserve">This chapter presents the results, analysis, and discussion of the hedging patterns identified in the 60 undergraduate thesis abstracts across Agriculture, Veterinary Medicine, and Biology at Pampanga State Agricultural University. The patterns are read as evidence of how these writers used English to manage claim strength in a short, supervised genre. The chapter is organized into four parts, each corresponding to a research question. Part I presents the types of hedging devices found across the three disciplines. Part II examines how hedge frequency varies across Agriculture, Veterinary Medicine, and Biology. Part III identifies the rhetorical functions served by the hedging devices. Part IV discusses the main cross-disciplinary contrast in the ratified abstracts of developing researchers at PSAU.</w:t>
       </w:r>
     </w:p>
     <w:p>

</xml_diff>